<commit_message>
Update Sự khác nhau giữa 2 cái spring.docx
</commit_message>
<xml_diff>
--- a/Slot1/Sự khác nhau giữa 2 cái spring.docx
+++ b/Slot1/Sự khác nhau giữa 2 cái spring.docx
@@ -20,8 +20,6 @@
         </w:rPr>
         <w:t>Sự khác nhau giữa 2 cái spring-framework và spring boot</w:t>
       </w:r>
-      <w:bookmarkStart w:id="74" w:name="_GoBack"/>
-      <w:bookmarkEnd w:id="74"/>
     </w:p>
     <w:p>
       <w:r>
@@ -52,7 +50,7 @@
         <w:fldChar w:fldCharType="begin"/>
       </w:r>
       <w:r>
-        <w:instrText xml:space="preserve"> HYPERLINK \l _Toc20587 </w:instrText>
+        <w:instrText xml:space="preserve"> HYPERLINK \l _Toc4981 </w:instrText>
       </w:r>
       <w:r>
         <w:fldChar w:fldCharType="separate"/>
@@ -70,7 +68,7 @@
         <w:fldChar w:fldCharType="begin"/>
       </w:r>
       <w:r>
-        <w:instrText xml:space="preserve"> PAGEREF _Toc20587 \h </w:instrText>
+        <w:instrText xml:space="preserve"> PAGEREF _Toc4981 \h </w:instrText>
       </w:r>
       <w:r>
         <w:fldChar w:fldCharType="separate"/>
@@ -96,7 +94,7 @@
         <w:fldChar w:fldCharType="begin"/>
       </w:r>
       <w:r>
-        <w:instrText xml:space="preserve"> HYPERLINK \l _Toc15899 </w:instrText>
+        <w:instrText xml:space="preserve"> HYPERLINK \l _Toc19827 </w:instrText>
       </w:r>
       <w:r>
         <w:fldChar w:fldCharType="separate"/>
@@ -121,7 +119,7 @@
         <w:fldChar w:fldCharType="begin"/>
       </w:r>
       <w:r>
-        <w:instrText xml:space="preserve"> PAGEREF _Toc15899 \h </w:instrText>
+        <w:instrText xml:space="preserve"> PAGEREF _Toc19827 \h </w:instrText>
       </w:r>
       <w:r>
         <w:fldChar w:fldCharType="separate"/>
@@ -147,7 +145,7 @@
         <w:fldChar w:fldCharType="begin"/>
       </w:r>
       <w:r>
-        <w:instrText xml:space="preserve"> HYPERLINK \l _Toc20686 </w:instrText>
+        <w:instrText xml:space="preserve"> HYPERLINK \l _Toc11623 </w:instrText>
       </w:r>
       <w:r>
         <w:fldChar w:fldCharType="separate"/>
@@ -165,7 +163,7 @@
         <w:fldChar w:fldCharType="begin"/>
       </w:r>
       <w:r>
-        <w:instrText xml:space="preserve"> PAGEREF _Toc20686 \h </w:instrText>
+        <w:instrText xml:space="preserve"> PAGEREF _Toc11623 \h </w:instrText>
       </w:r>
       <w:r>
         <w:fldChar w:fldCharType="separate"/>
@@ -191,7 +189,7 @@
         <w:fldChar w:fldCharType="begin"/>
       </w:r>
       <w:r>
-        <w:instrText xml:space="preserve"> HYPERLINK \l _Toc18143 </w:instrText>
+        <w:instrText xml:space="preserve"> HYPERLINK \l _Toc21811 </w:instrText>
       </w:r>
       <w:r>
         <w:fldChar w:fldCharType="separate"/>
@@ -216,7 +214,7 @@
         <w:fldChar w:fldCharType="begin"/>
       </w:r>
       <w:r>
-        <w:instrText xml:space="preserve"> PAGEREF _Toc18143 \h </w:instrText>
+        <w:instrText xml:space="preserve"> PAGEREF _Toc21811 \h </w:instrText>
       </w:r>
       <w:r>
         <w:fldChar w:fldCharType="separate"/>
@@ -242,7 +240,7 @@
         <w:fldChar w:fldCharType="begin"/>
       </w:r>
       <w:r>
-        <w:instrText xml:space="preserve"> HYPERLINK \l _Toc21978 </w:instrText>
+        <w:instrText xml:space="preserve"> HYPERLINK \l _Toc29320 </w:instrText>
       </w:r>
       <w:r>
         <w:fldChar w:fldCharType="separate"/>
@@ -267,7 +265,7 @@
         <w:fldChar w:fldCharType="begin"/>
       </w:r>
       <w:r>
-        <w:instrText xml:space="preserve"> PAGEREF _Toc21978 \h </w:instrText>
+        <w:instrText xml:space="preserve"> PAGEREF _Toc29320 \h </w:instrText>
       </w:r>
       <w:r>
         <w:fldChar w:fldCharType="separate"/>
@@ -293,7 +291,7 @@
         <w:fldChar w:fldCharType="begin"/>
       </w:r>
       <w:r>
-        <w:instrText xml:space="preserve"> HYPERLINK \l _Toc8782 </w:instrText>
+        <w:instrText xml:space="preserve"> HYPERLINK \l _Toc22858 </w:instrText>
       </w:r>
       <w:r>
         <w:fldChar w:fldCharType="separate"/>
@@ -311,7 +309,7 @@
         <w:fldChar w:fldCharType="begin"/>
       </w:r>
       <w:r>
-        <w:instrText xml:space="preserve"> PAGEREF _Toc8782 \h </w:instrText>
+        <w:instrText xml:space="preserve"> PAGEREF _Toc22858 \h </w:instrText>
       </w:r>
       <w:r>
         <w:fldChar w:fldCharType="separate"/>
@@ -337,7 +335,7 @@
         <w:fldChar w:fldCharType="begin"/>
       </w:r>
       <w:r>
-        <w:instrText xml:space="preserve"> HYPERLINK \l _Toc10742 </w:instrText>
+        <w:instrText xml:space="preserve"> HYPERLINK \l _Toc12786 </w:instrText>
       </w:r>
       <w:r>
         <w:fldChar w:fldCharType="separate"/>
@@ -362,7 +360,7 @@
         <w:fldChar w:fldCharType="begin"/>
       </w:r>
       <w:r>
-        <w:instrText xml:space="preserve"> PAGEREF _Toc10742 \h </w:instrText>
+        <w:instrText xml:space="preserve"> PAGEREF _Toc12786 \h </w:instrText>
       </w:r>
       <w:r>
         <w:fldChar w:fldCharType="separate"/>
@@ -388,7 +386,7 @@
         <w:fldChar w:fldCharType="begin"/>
       </w:r>
       <w:r>
-        <w:instrText xml:space="preserve"> HYPERLINK \l _Toc102 </w:instrText>
+        <w:instrText xml:space="preserve"> HYPERLINK \l _Toc26016 </w:instrText>
       </w:r>
       <w:r>
         <w:fldChar w:fldCharType="separate"/>
@@ -414,7 +412,7 @@
         <w:fldChar w:fldCharType="begin"/>
       </w:r>
       <w:r>
-        <w:instrText xml:space="preserve"> PAGEREF _Toc102 \h </w:instrText>
+        <w:instrText xml:space="preserve"> PAGEREF _Toc26016 \h </w:instrText>
       </w:r>
       <w:r>
         <w:fldChar w:fldCharType="separate"/>
@@ -440,7 +438,7 @@
         <w:fldChar w:fldCharType="begin"/>
       </w:r>
       <w:r>
-        <w:instrText xml:space="preserve"> HYPERLINK \l _Toc22413 </w:instrText>
+        <w:instrText xml:space="preserve"> HYPERLINK \l _Toc9302 </w:instrText>
       </w:r>
       <w:r>
         <w:fldChar w:fldCharType="separate"/>
@@ -466,13 +464,278 @@
         <w:fldChar w:fldCharType="begin"/>
       </w:r>
       <w:r>
-        <w:instrText xml:space="preserve"> PAGEREF _Toc22413 \h </w:instrText>
+        <w:instrText xml:space="preserve"> PAGEREF _Toc9302 \h </w:instrText>
       </w:r>
       <w:r>
         <w:fldChar w:fldCharType="separate"/>
       </w:r>
       <w:r>
         <w:t>4</w:t>
+      </w:r>
+      <w:r>
+        <w:fldChar w:fldCharType="end"/>
+      </w:r>
+      <w:r>
+        <w:fldChar w:fldCharType="end"/>
+      </w:r>
+    </w:p>
+    <w:p>
+      <w:pPr>
+        <w:pStyle w:val="13"/>
+        <w:tabs>
+          <w:tab w:val="right" w:leader="dot" w:pos="8306"/>
+        </w:tabs>
+      </w:pPr>
+      <w:r>
+        <w:fldChar w:fldCharType="begin"/>
+      </w:r>
+      <w:r>
+        <w:instrText xml:space="preserve"> HYPERLINK \l _Toc25314 </w:instrText>
+      </w:r>
+      <w:r>
+        <w:fldChar w:fldCharType="separate"/>
+      </w:r>
+      <w:r>
+        <w:rPr>
+          <w:rFonts w:hint="default"/>
+          <w:lang w:val="vi-VN"/>
+        </w:rPr>
+        <w:t>Các lệnh của git:</w:t>
+      </w:r>
+      <w:r>
+        <w:tab/>
+      </w:r>
+      <w:r>
+        <w:fldChar w:fldCharType="begin"/>
+      </w:r>
+      <w:r>
+        <w:instrText xml:space="preserve"> PAGEREF _Toc25314 \h </w:instrText>
+      </w:r>
+      <w:r>
+        <w:fldChar w:fldCharType="separate"/>
+      </w:r>
+      <w:r>
+        <w:t>6</w:t>
+      </w:r>
+      <w:r>
+        <w:fldChar w:fldCharType="end"/>
+      </w:r>
+      <w:r>
+        <w:fldChar w:fldCharType="end"/>
+      </w:r>
+    </w:p>
+    <w:p>
+      <w:pPr>
+        <w:pStyle w:val="13"/>
+        <w:tabs>
+          <w:tab w:val="right" w:leader="dot" w:pos="8306"/>
+        </w:tabs>
+      </w:pPr>
+      <w:r>
+        <w:fldChar w:fldCharType="begin"/>
+      </w:r>
+      <w:r>
+        <w:instrText xml:space="preserve"> HYPERLINK \l _Toc24424 </w:instrText>
+      </w:r>
+      <w:r>
+        <w:fldChar w:fldCharType="separate"/>
+      </w:r>
+      <w:r>
+        <w:rPr>
+          <w:rFonts w:hint="default"/>
+        </w:rPr>
+        <w:t>1. Khởi tạo và Cấu hình</w:t>
+      </w:r>
+      <w:r>
+        <w:tab/>
+      </w:r>
+      <w:r>
+        <w:fldChar w:fldCharType="begin"/>
+      </w:r>
+      <w:r>
+        <w:instrText xml:space="preserve"> PAGEREF _Toc24424 \h </w:instrText>
+      </w:r>
+      <w:r>
+        <w:fldChar w:fldCharType="separate"/>
+      </w:r>
+      <w:r>
+        <w:t>6</w:t>
+      </w:r>
+      <w:r>
+        <w:fldChar w:fldCharType="end"/>
+      </w:r>
+      <w:r>
+        <w:fldChar w:fldCharType="end"/>
+      </w:r>
+    </w:p>
+    <w:p>
+      <w:pPr>
+        <w:pStyle w:val="13"/>
+        <w:tabs>
+          <w:tab w:val="right" w:leader="dot" w:pos="8306"/>
+        </w:tabs>
+      </w:pPr>
+      <w:r>
+        <w:fldChar w:fldCharType="begin"/>
+      </w:r>
+      <w:r>
+        <w:instrText xml:space="preserve"> HYPERLINK \l _Toc2245 </w:instrText>
+      </w:r>
+      <w:r>
+        <w:fldChar w:fldCharType="separate"/>
+      </w:r>
+      <w:r>
+        <w:rPr>
+          <w:rFonts w:hint="default"/>
+        </w:rPr>
+        <w:t>2. Luồng công việc cơ bản (The Basic Workflow)</w:t>
+      </w:r>
+      <w:r>
+        <w:tab/>
+      </w:r>
+      <w:r>
+        <w:fldChar w:fldCharType="begin"/>
+      </w:r>
+      <w:r>
+        <w:instrText xml:space="preserve"> PAGEREF _Toc2245 \h </w:instrText>
+      </w:r>
+      <w:r>
+        <w:fldChar w:fldCharType="separate"/>
+      </w:r>
+      <w:r>
+        <w:t>6</w:t>
+      </w:r>
+      <w:r>
+        <w:fldChar w:fldCharType="end"/>
+      </w:r>
+      <w:r>
+        <w:fldChar w:fldCharType="end"/>
+      </w:r>
+    </w:p>
+    <w:p>
+      <w:pPr>
+        <w:pStyle w:val="13"/>
+        <w:tabs>
+          <w:tab w:val="right" w:leader="dot" w:pos="8306"/>
+        </w:tabs>
+      </w:pPr>
+      <w:r>
+        <w:fldChar w:fldCharType="begin"/>
+      </w:r>
+      <w:r>
+        <w:instrText xml:space="preserve"> HYPERLINK \l _Toc6545 </w:instrText>
+      </w:r>
+      <w:r>
+        <w:fldChar w:fldCharType="separate"/>
+      </w:r>
+      <w:r>
+        <w:rPr>
+          <w:rFonts w:hint="default"/>
+        </w:rPr>
+        <w:t>3. Quản lý Nhánh (Branching)</w:t>
+      </w:r>
+      <w:r>
+        <w:tab/>
+      </w:r>
+      <w:r>
+        <w:fldChar w:fldCharType="begin"/>
+      </w:r>
+      <w:r>
+        <w:instrText xml:space="preserve"> PAGEREF _Toc6545 \h </w:instrText>
+      </w:r>
+      <w:r>
+        <w:fldChar w:fldCharType="separate"/>
+      </w:r>
+      <w:r>
+        <w:t>6</w:t>
+      </w:r>
+      <w:r>
+        <w:fldChar w:fldCharType="end"/>
+      </w:r>
+      <w:r>
+        <w:fldChar w:fldCharType="end"/>
+      </w:r>
+    </w:p>
+    <w:p>
+      <w:pPr>
+        <w:pStyle w:val="13"/>
+        <w:tabs>
+          <w:tab w:val="right" w:leader="dot" w:pos="8306"/>
+        </w:tabs>
+      </w:pPr>
+      <w:r>
+        <w:fldChar w:fldCharType="begin"/>
+      </w:r>
+      <w:r>
+        <w:instrText xml:space="preserve"> HYPERLINK \l _Toc17267 </w:instrText>
+      </w:r>
+      <w:r>
+        <w:fldChar w:fldCharType="separate"/>
+      </w:r>
+      <w:r>
+        <w:rPr>
+          <w:rFonts w:hint="default"/>
+        </w:rPr>
+        <w:t>4. Đồng bộ với Remote Repository</w:t>
+      </w:r>
+      <w:r>
+        <w:tab/>
+      </w:r>
+      <w:r>
+        <w:fldChar w:fldCharType="begin"/>
+      </w:r>
+      <w:r>
+        <w:instrText xml:space="preserve"> PAGEREF _Toc17267 \h </w:instrText>
+      </w:r>
+      <w:r>
+        <w:fldChar w:fldCharType="separate"/>
+      </w:r>
+      <w:r>
+        <w:t>7</w:t>
+      </w:r>
+      <w:r>
+        <w:fldChar w:fldCharType="end"/>
+      </w:r>
+      <w:r>
+        <w:fldChar w:fldCharType="end"/>
+      </w:r>
+    </w:p>
+    <w:p>
+      <w:pPr>
+        <w:pStyle w:val="13"/>
+        <w:tabs>
+          <w:tab w:val="right" w:leader="dot" w:pos="8306"/>
+        </w:tabs>
+      </w:pPr>
+      <w:r>
+        <w:fldChar w:fldCharType="begin"/>
+      </w:r>
+      <w:r>
+        <w:instrText xml:space="preserve"> HYPERLINK \l _Toc26672 </w:instrText>
+      </w:r>
+      <w:r>
+        <w:fldChar w:fldCharType="separate"/>
+      </w:r>
+      <w:r>
+        <w:rPr>
+          <w:rFonts w:hint="default"/>
+        </w:rPr>
+        <w:t>5. Hoàn tác và Sửa lỗi (Undo)</w:t>
+      </w:r>
+      <w:r>
+        <w:tab/>
+      </w:r>
+      <w:r>
+        <w:fldChar w:fldCharType="begin"/>
+      </w:r>
+      <w:r>
+        <w:instrText xml:space="preserve"> PAGEREF _Toc26672 \h </w:instrText>
+      </w:r>
+      <w:r>
+        <w:fldChar w:fldCharType="separate"/>
+      </w:r>
+      <w:r>
+        <w:t>7</w:t>
       </w:r>
       <w:r>
         <w:fldChar w:fldCharType="end"/>
@@ -585,7 +848,8 @@
       <w:bookmarkStart w:id="5" w:name="_Toc30852"/>
       <w:bookmarkStart w:id="6" w:name="_Toc23327"/>
       <w:bookmarkStart w:id="7" w:name="_Toc16419"/>
-      <w:bookmarkStart w:id="8" w:name="_Toc20587"/>
+      <w:bookmarkStart w:id="8" w:name="_Toc944"/>
+      <w:bookmarkStart w:id="9" w:name="_Toc4981"/>
       <w:r>
         <w:rPr>
           <w:rFonts w:hint="default"/>
@@ -601,6 +865,7 @@
       <w:bookmarkEnd w:id="6"/>
       <w:bookmarkEnd w:id="7"/>
       <w:bookmarkEnd w:id="8"/>
+      <w:bookmarkEnd w:id="9"/>
     </w:p>
     <w:p>
       <w:pPr>
@@ -629,22 +894,22 @@
           <w:rFonts w:hint="default"/>
         </w:rPr>
       </w:pPr>
-      <w:bookmarkStart w:id="9" w:name="_Toc19293"/>
-      <w:bookmarkStart w:id="10" w:name="_Toc2483"/>
-      <w:bookmarkStart w:id="11" w:name="_Toc368"/>
-      <w:bookmarkStart w:id="12" w:name="_Toc15528"/>
-      <w:bookmarkStart w:id="13" w:name="_Toc11685"/>
-      <w:bookmarkStart w:id="14" w:name="_Toc10852"/>
-      <w:bookmarkStart w:id="15" w:name="_Toc23469"/>
-      <w:bookmarkStart w:id="16" w:name="_Toc14645"/>
-      <w:bookmarkStart w:id="17" w:name="_Toc15899"/>
+      <w:bookmarkStart w:id="10" w:name="_Toc19293"/>
+      <w:bookmarkStart w:id="11" w:name="_Toc2483"/>
+      <w:bookmarkStart w:id="12" w:name="_Toc368"/>
+      <w:bookmarkStart w:id="13" w:name="_Toc15528"/>
+      <w:bookmarkStart w:id="14" w:name="_Toc11685"/>
+      <w:bookmarkStart w:id="15" w:name="_Toc10852"/>
+      <w:bookmarkStart w:id="16" w:name="_Toc23469"/>
+      <w:bookmarkStart w:id="17" w:name="_Toc14645"/>
+      <w:bookmarkStart w:id="18" w:name="_Toc414"/>
+      <w:bookmarkStart w:id="19" w:name="_Toc19827"/>
       <w:r>
         <w:rPr>
           <w:rFonts w:hint="default"/>
         </w:rPr>
         <w:t>Các thành phần cốt lõi:</w:t>
       </w:r>
-      <w:bookmarkEnd w:id="9"/>
       <w:bookmarkEnd w:id="10"/>
       <w:bookmarkEnd w:id="11"/>
       <w:bookmarkEnd w:id="12"/>
@@ -653,6 +918,8 @@
       <w:bookmarkEnd w:id="15"/>
       <w:bookmarkEnd w:id="16"/>
       <w:bookmarkEnd w:id="17"/>
+      <w:bookmarkEnd w:id="18"/>
+      <w:bookmarkEnd w:id="19"/>
     </w:p>
     <w:p>
       <w:pPr>
@@ -751,23 +1018,22 @@
           <w:rFonts w:hint="default"/>
         </w:rPr>
       </w:pPr>
-      <w:bookmarkStart w:id="18" w:name="_Toc2979"/>
-      <w:bookmarkStart w:id="19" w:name="_Toc837"/>
-      <w:bookmarkStart w:id="20" w:name="_Toc20610"/>
-      <w:bookmarkStart w:id="21" w:name="_Toc7579"/>
-      <w:bookmarkStart w:id="22" w:name="_Toc5852"/>
-      <w:bookmarkStart w:id="23" w:name="_Toc20493"/>
-      <w:bookmarkStart w:id="24" w:name="_Toc13717"/>
-      <w:bookmarkStart w:id="25" w:name="_Toc5538"/>
-      <w:bookmarkStart w:id="26" w:name="_Toc20686"/>
+      <w:bookmarkStart w:id="20" w:name="_Toc2979"/>
+      <w:bookmarkStart w:id="21" w:name="_Toc837"/>
+      <w:bookmarkStart w:id="22" w:name="_Toc20610"/>
+      <w:bookmarkStart w:id="23" w:name="_Toc7579"/>
+      <w:bookmarkStart w:id="24" w:name="_Toc5852"/>
+      <w:bookmarkStart w:id="25" w:name="_Toc20493"/>
+      <w:bookmarkStart w:id="26" w:name="_Toc13717"/>
+      <w:bookmarkStart w:id="27" w:name="_Toc5538"/>
+      <w:bookmarkStart w:id="28" w:name="_Toc4529"/>
+      <w:bookmarkStart w:id="29" w:name="_Toc11623"/>
       <w:r>
         <w:rPr>
           <w:rFonts w:hint="default"/>
         </w:rPr>
         <w:t>Spring Boot là gì?</w:t>
       </w:r>
-      <w:bookmarkEnd w:id="18"/>
-      <w:bookmarkEnd w:id="19"/>
       <w:bookmarkEnd w:id="20"/>
       <w:bookmarkEnd w:id="21"/>
       <w:bookmarkEnd w:id="22"/>
@@ -775,6 +1041,9 @@
       <w:bookmarkEnd w:id="24"/>
       <w:bookmarkEnd w:id="25"/>
       <w:bookmarkEnd w:id="26"/>
+      <w:bookmarkEnd w:id="27"/>
+      <w:bookmarkEnd w:id="28"/>
+      <w:bookmarkEnd w:id="29"/>
     </w:p>
     <w:p>
       <w:pPr>
@@ -857,30 +1126,32 @@
           <w:rFonts w:hint="default"/>
         </w:rPr>
       </w:pPr>
-      <w:bookmarkStart w:id="27" w:name="_Toc8169"/>
-      <w:bookmarkStart w:id="28" w:name="_Toc8498"/>
-      <w:bookmarkStart w:id="29" w:name="_Toc11644"/>
-      <w:bookmarkStart w:id="30" w:name="_Toc3593"/>
-      <w:bookmarkStart w:id="31" w:name="_Toc20918"/>
-      <w:bookmarkStart w:id="32" w:name="_Toc26470"/>
-      <w:bookmarkStart w:id="33" w:name="_Toc31891"/>
-      <w:bookmarkStart w:id="34" w:name="_Toc5985"/>
-      <w:bookmarkStart w:id="35" w:name="_Toc18143"/>
+      <w:bookmarkStart w:id="30" w:name="_Toc8169"/>
+      <w:bookmarkStart w:id="31" w:name="_Toc8498"/>
+      <w:bookmarkStart w:id="32" w:name="_Toc11644"/>
+      <w:bookmarkStart w:id="33" w:name="_Toc3593"/>
+      <w:bookmarkStart w:id="34" w:name="_Toc20918"/>
+      <w:bookmarkStart w:id="35" w:name="_Toc26470"/>
+      <w:bookmarkStart w:id="36" w:name="_Toc31891"/>
+      <w:bookmarkStart w:id="37" w:name="_Toc5985"/>
+      <w:bookmarkStart w:id="38" w:name="_Toc30677"/>
+      <w:bookmarkStart w:id="39" w:name="_Toc21811"/>
       <w:r>
         <w:rPr>
           <w:rFonts w:hint="default"/>
         </w:rPr>
         <w:t>So sánh Ưu điểm và Hạn chế</w:t>
       </w:r>
-      <w:bookmarkEnd w:id="27"/>
-      <w:bookmarkEnd w:id="28"/>
-      <w:bookmarkEnd w:id="29"/>
       <w:bookmarkEnd w:id="30"/>
       <w:bookmarkEnd w:id="31"/>
       <w:bookmarkEnd w:id="32"/>
       <w:bookmarkEnd w:id="33"/>
       <w:bookmarkEnd w:id="34"/>
       <w:bookmarkEnd w:id="35"/>
+      <w:bookmarkEnd w:id="36"/>
+      <w:bookmarkEnd w:id="37"/>
+      <w:bookmarkEnd w:id="38"/>
+      <w:bookmarkEnd w:id="39"/>
       <w:r>
         <w:rPr>
           <w:rFonts w:hint="default"/>
@@ -1285,30 +1556,32 @@
           <w:rFonts w:hint="default"/>
         </w:rPr>
       </w:pPr>
-      <w:bookmarkStart w:id="36" w:name="_Toc9331"/>
-      <w:bookmarkStart w:id="37" w:name="_Toc7533"/>
-      <w:bookmarkStart w:id="38" w:name="_Toc26732"/>
-      <w:bookmarkStart w:id="39" w:name="_Toc8923"/>
-      <w:bookmarkStart w:id="40" w:name="_Toc19800"/>
-      <w:bookmarkStart w:id="41" w:name="_Toc6602"/>
-      <w:bookmarkStart w:id="42" w:name="_Toc13095"/>
-      <w:bookmarkStart w:id="43" w:name="_Toc17213"/>
-      <w:bookmarkStart w:id="44" w:name="_Toc21978"/>
+      <w:bookmarkStart w:id="40" w:name="_Toc9331"/>
+      <w:bookmarkStart w:id="41" w:name="_Toc7533"/>
+      <w:bookmarkStart w:id="42" w:name="_Toc26732"/>
+      <w:bookmarkStart w:id="43" w:name="_Toc8923"/>
+      <w:bookmarkStart w:id="44" w:name="_Toc19800"/>
+      <w:bookmarkStart w:id="45" w:name="_Toc6602"/>
+      <w:bookmarkStart w:id="46" w:name="_Toc13095"/>
+      <w:bookmarkStart w:id="47" w:name="_Toc17213"/>
+      <w:bookmarkStart w:id="48" w:name="_Toc9862"/>
+      <w:bookmarkStart w:id="49" w:name="_Toc29320"/>
       <w:r>
         <w:rPr>
           <w:rFonts w:hint="default"/>
         </w:rPr>
         <w:t>Spring Boot (Tiện ích mở rộng)</w:t>
       </w:r>
-      <w:bookmarkEnd w:id="36"/>
-      <w:bookmarkEnd w:id="37"/>
-      <w:bookmarkEnd w:id="38"/>
-      <w:bookmarkEnd w:id="39"/>
       <w:bookmarkEnd w:id="40"/>
       <w:bookmarkEnd w:id="41"/>
       <w:bookmarkEnd w:id="42"/>
       <w:bookmarkEnd w:id="43"/>
       <w:bookmarkEnd w:id="44"/>
+      <w:bookmarkEnd w:id="45"/>
+      <w:bookmarkEnd w:id="46"/>
+      <w:bookmarkEnd w:id="47"/>
+      <w:bookmarkEnd w:id="48"/>
+      <w:bookmarkEnd w:id="49"/>
     </w:p>
     <w:tbl>
       <w:tblPr>
@@ -1525,6 +1798,7 @@
             <w:insideH w:val="none" w:color="auto" w:sz="0" w:space="0"/>
             <w:insideV w:val="none" w:color="auto" w:sz="0" w:space="0"/>
           </w:tblBorders>
+          <w:shd w:val="clear"/>
           <w:tblCellMar>
             <w:top w:w="0" w:type="dxa"/>
             <w:left w:w="0" w:type="dxa"/>
@@ -1613,6 +1887,7 @@
             <w:insideH w:val="none" w:color="auto" w:sz="0" w:space="0"/>
             <w:insideV w:val="none" w:color="auto" w:sz="0" w:space="0"/>
           </w:tblBorders>
+          <w:shd w:val="clear"/>
           <w:tblCellMar>
             <w:top w:w="0" w:type="dxa"/>
             <w:left w:w="0" w:type="dxa"/>
@@ -1762,30 +2037,32 @@
           <w:rFonts w:hint="default"/>
         </w:rPr>
       </w:pPr>
-      <w:bookmarkStart w:id="45" w:name="_Toc680"/>
-      <w:bookmarkStart w:id="46" w:name="_Toc1256"/>
-      <w:bookmarkStart w:id="47" w:name="_Toc28854"/>
-      <w:bookmarkStart w:id="48" w:name="_Toc4677"/>
-      <w:bookmarkStart w:id="49" w:name="_Toc26324"/>
-      <w:bookmarkStart w:id="50" w:name="_Toc9473"/>
-      <w:bookmarkStart w:id="51" w:name="_Toc4021"/>
-      <w:bookmarkStart w:id="52" w:name="_Toc2511"/>
-      <w:bookmarkStart w:id="53" w:name="_Toc8782"/>
+      <w:bookmarkStart w:id="50" w:name="_Toc680"/>
+      <w:bookmarkStart w:id="51" w:name="_Toc1256"/>
+      <w:bookmarkStart w:id="52" w:name="_Toc28854"/>
+      <w:bookmarkStart w:id="53" w:name="_Toc4677"/>
+      <w:bookmarkStart w:id="54" w:name="_Toc26324"/>
+      <w:bookmarkStart w:id="55" w:name="_Toc9473"/>
+      <w:bookmarkStart w:id="56" w:name="_Toc4021"/>
+      <w:bookmarkStart w:id="57" w:name="_Toc2511"/>
+      <w:bookmarkStart w:id="58" w:name="_Toc19079"/>
+      <w:bookmarkStart w:id="59" w:name="_Toc22858"/>
       <w:r>
         <w:rPr>
           <w:rFonts w:hint="default"/>
         </w:rPr>
         <w:t>Khi nào nên dùng cái nào?</w:t>
       </w:r>
-      <w:bookmarkEnd w:id="45"/>
-      <w:bookmarkEnd w:id="46"/>
-      <w:bookmarkEnd w:id="47"/>
-      <w:bookmarkEnd w:id="48"/>
-      <w:bookmarkEnd w:id="49"/>
       <w:bookmarkEnd w:id="50"/>
       <w:bookmarkEnd w:id="51"/>
       <w:bookmarkEnd w:id="52"/>
       <w:bookmarkEnd w:id="53"/>
+      <w:bookmarkEnd w:id="54"/>
+      <w:bookmarkEnd w:id="55"/>
+      <w:bookmarkEnd w:id="56"/>
+      <w:bookmarkEnd w:id="57"/>
+      <w:bookmarkEnd w:id="58"/>
+      <w:bookmarkEnd w:id="59"/>
     </w:p>
     <w:p>
       <w:pPr>
@@ -1799,19 +2076,21 @@
           <w:rFonts w:hint="default"/>
         </w:rPr>
       </w:pPr>
-      <w:bookmarkStart w:id="54" w:name="_Toc10742"/>
-      <w:bookmarkStart w:id="55" w:name="_Toc22996"/>
-      <w:bookmarkStart w:id="56" w:name="_Toc618"/>
-      <w:bookmarkStart w:id="57" w:name="_Toc14629"/>
-      <w:bookmarkStart w:id="58" w:name="_Toc20567"/>
-      <w:bookmarkStart w:id="59" w:name="_Toc32599"/>
+      <w:bookmarkStart w:id="60" w:name="_Toc5109"/>
+      <w:bookmarkStart w:id="61" w:name="_Toc12786"/>
+      <w:bookmarkStart w:id="62" w:name="_Toc22996"/>
+      <w:bookmarkStart w:id="63" w:name="_Toc618"/>
+      <w:bookmarkStart w:id="64" w:name="_Toc14629"/>
+      <w:bookmarkStart w:id="65" w:name="_Toc20567"/>
+      <w:bookmarkStart w:id="66" w:name="_Toc32599"/>
       <w:r>
         <w:rPr>
           <w:rFonts w:hint="default"/>
         </w:rPr>
         <w:t>Dùng Spring Boot:</w:t>
       </w:r>
-      <w:bookmarkEnd w:id="54"/>
+      <w:bookmarkEnd w:id="60"/>
+      <w:bookmarkEnd w:id="61"/>
     </w:p>
     <w:p>
       <w:pPr>
@@ -1827,11 +2106,11 @@
         </w:rPr>
         <w:t>Cho hầu hết các dự án hiện đại, đặc biệt là kiến trúc Microservices hoặc các dự án cần triển khai nhanh (MVP). Đây là tiêu chuẩn ngành hiện nay</w:t>
       </w:r>
-      <w:bookmarkEnd w:id="55"/>
-      <w:bookmarkEnd w:id="56"/>
-      <w:bookmarkEnd w:id="57"/>
-      <w:bookmarkEnd w:id="58"/>
-      <w:bookmarkEnd w:id="59"/>
+      <w:bookmarkEnd w:id="62"/>
+      <w:bookmarkEnd w:id="63"/>
+      <w:bookmarkEnd w:id="64"/>
+      <w:bookmarkEnd w:id="65"/>
+      <w:bookmarkEnd w:id="66"/>
     </w:p>
     <w:p>
       <w:pPr>
@@ -1846,12 +2125,13 @@
           <w:lang w:val="vi-VN"/>
         </w:rPr>
       </w:pPr>
-      <w:bookmarkStart w:id="60" w:name="_Toc9073"/>
-      <w:bookmarkStart w:id="61" w:name="_Toc4086"/>
-      <w:bookmarkStart w:id="62" w:name="_Toc17552"/>
-      <w:bookmarkStart w:id="63" w:name="_Toc17918"/>
-      <w:bookmarkStart w:id="64" w:name="_Toc3063"/>
-      <w:bookmarkStart w:id="65" w:name="_Toc102"/>
+      <w:bookmarkStart w:id="67" w:name="_Toc9073"/>
+      <w:bookmarkStart w:id="68" w:name="_Toc4086"/>
+      <w:bookmarkStart w:id="69" w:name="_Toc17552"/>
+      <w:bookmarkStart w:id="70" w:name="_Toc17918"/>
+      <w:bookmarkStart w:id="71" w:name="_Toc3063"/>
+      <w:bookmarkStart w:id="72" w:name="_Toc1613"/>
+      <w:bookmarkStart w:id="73" w:name="_Toc26016"/>
       <w:r>
         <w:rPr>
           <w:rFonts w:hint="default"/>
@@ -1866,12 +2146,13 @@
         </w:rPr>
         <w:t>:</w:t>
       </w:r>
-      <w:bookmarkEnd w:id="60"/>
-      <w:bookmarkEnd w:id="61"/>
-      <w:bookmarkEnd w:id="62"/>
-      <w:bookmarkEnd w:id="63"/>
-      <w:bookmarkEnd w:id="64"/>
-      <w:bookmarkEnd w:id="65"/>
+      <w:bookmarkEnd w:id="67"/>
+      <w:bookmarkEnd w:id="68"/>
+      <w:bookmarkEnd w:id="69"/>
+      <w:bookmarkEnd w:id="70"/>
+      <w:bookmarkEnd w:id="71"/>
+      <w:bookmarkEnd w:id="72"/>
+      <w:bookmarkEnd w:id="73"/>
     </w:p>
     <w:p>
       <w:pPr>
@@ -1889,12 +2170,13 @@
           <w:b w:val="0"/>
         </w:rPr>
       </w:pPr>
-      <w:bookmarkStart w:id="66" w:name="_Toc22413"/>
-      <w:bookmarkStart w:id="67" w:name="_Toc173"/>
-      <w:bookmarkStart w:id="68" w:name="_Toc15641"/>
-      <w:bookmarkStart w:id="69" w:name="_Toc20285"/>
-      <w:bookmarkStart w:id="70" w:name="_Toc20243"/>
-      <w:bookmarkStart w:id="71" w:name="_Toc929"/>
+      <w:bookmarkStart w:id="74" w:name="_Toc13964"/>
+      <w:bookmarkStart w:id="75" w:name="_Toc9302"/>
+      <w:bookmarkStart w:id="76" w:name="_Toc173"/>
+      <w:bookmarkStart w:id="77" w:name="_Toc15641"/>
+      <w:bookmarkStart w:id="78" w:name="_Toc20285"/>
+      <w:bookmarkStart w:id="79" w:name="_Toc20243"/>
+      <w:bookmarkStart w:id="80" w:name="_Toc929"/>
       <w:r>
         <w:rPr>
           <w:rStyle w:val="20"/>
@@ -1903,7 +2185,8 @@
         </w:rPr>
         <w:t>Dùng Spring Framework thuần:</w:t>
       </w:r>
-      <w:bookmarkEnd w:id="66"/>
+      <w:bookmarkEnd w:id="74"/>
+      <w:bookmarkEnd w:id="75"/>
       <w:r>
         <w:rPr>
           <w:rStyle w:val="20"/>
@@ -1928,11 +2211,11 @@
         </w:rPr>
         <w:t>Khi bạn làm việc với các hệ thống cũ (Legacy systems) hoặc các dự án đặc thù yêu cầu kiểm soát cấu hình cực kỳ chặt chẽ mà Spring Boot không đáp ứng được linh hoạt.</w:t>
       </w:r>
-      <w:bookmarkEnd w:id="67"/>
-      <w:bookmarkEnd w:id="68"/>
-      <w:bookmarkEnd w:id="69"/>
-      <w:bookmarkEnd w:id="70"/>
-      <w:bookmarkEnd w:id="71"/>
+      <w:bookmarkEnd w:id="76"/>
+      <w:bookmarkEnd w:id="77"/>
+      <w:bookmarkEnd w:id="78"/>
+      <w:bookmarkEnd w:id="79"/>
+      <w:bookmarkEnd w:id="80"/>
     </w:p>
     <w:p>
       <w:pPr>
@@ -2157,7 +2440,7 @@
           <w:lang w:val="en-US"/>
         </w:rPr>
       </w:pPr>
-      <w:bookmarkStart w:id="72" w:name="_Toc26296"/>
+      <w:bookmarkStart w:id="81" w:name="_Toc26296"/>
       <w:r>
         <w:rPr>
           <w:rFonts w:hint="default"/>
@@ -2165,27 +2448,7 @@
         </w:rPr>
         <w:t>Hinh anh 1.1</w:t>
       </w:r>
-      <w:bookmarkEnd w:id="72"/>
-    </w:p>
-    <w:p>
-      <w:pPr>
-        <w:pStyle w:val="16"/>
-        <w:bidi w:val="0"/>
-        <w:rPr>
-          <w:rFonts w:hint="default"/>
-          <w:lang w:val="en-US"/>
-        </w:rPr>
-      </w:pPr>
-    </w:p>
-    <w:p>
-      <w:pPr>
-        <w:pStyle w:val="16"/>
-        <w:bidi w:val="0"/>
-        <w:rPr>
-          <w:rFonts w:hint="default"/>
-          <w:lang w:val="en-US"/>
-        </w:rPr>
-      </w:pPr>
+      <w:bookmarkEnd w:id="81"/>
     </w:p>
     <w:p>
       <w:pPr>
@@ -2195,9 +2458,9 @@
       <w:r>
         <w:drawing>
           <wp:inline distT="0" distB="0" distL="114300" distR="114300">
-            <wp:extent cx="5271770" cy="4462780"/>
-            <wp:effectExtent l="0" t="0" r="1270" b="2540"/>
-            <wp:docPr id="2" name="Picture 7"/>
+            <wp:extent cx="4221480" cy="3573780"/>
+            <wp:effectExtent l="0" t="0" r="0" b="7620"/>
+            <wp:docPr id="8" name="Picture 8"/>
             <wp:cNvGraphicFramePr>
               <a:graphicFrameLocks xmlns:a="http://schemas.openxmlformats.org/drawingml/2006/main" noChangeAspect="1"/>
             </wp:cNvGraphicFramePr>
@@ -2205,7 +2468,7 @@
               <a:graphicData uri="http://schemas.openxmlformats.org/drawingml/2006/picture">
                 <pic:pic xmlns:pic="http://schemas.openxmlformats.org/drawingml/2006/picture">
                   <pic:nvPicPr>
-                    <pic:cNvPr id="2" name="Picture 7"/>
+                    <pic:cNvPr id="8" name="Picture 8"/>
                     <pic:cNvPicPr>
                       <a:picLocks noChangeAspect="1"/>
                     </pic:cNvPicPr>
@@ -2219,7 +2482,7 @@
                   <pic:spPr>
                     <a:xfrm>
                       <a:off x="0" y="0"/>
-                      <a:ext cx="5271770" cy="4462780"/>
+                      <a:ext cx="4221480" cy="3573780"/>
                     </a:xfrm>
                     <a:prstGeom prst="rect">
                       <a:avLst/>
@@ -2245,7 +2508,7 @@
           <w:lang w:val="en-US"/>
         </w:rPr>
       </w:pPr>
-      <w:bookmarkStart w:id="73" w:name="_Toc2450"/>
+      <w:bookmarkStart w:id="82" w:name="_Toc2450"/>
       <w:r>
         <w:rPr>
           <w:rFonts w:hint="default"/>
@@ -2253,7 +2516,116 @@
         </w:rPr>
         <w:t>Hinh anh 1.2</w:t>
       </w:r>
-      <w:bookmarkEnd w:id="73"/>
+      <w:bookmarkEnd w:id="82"/>
+    </w:p>
+    <w:p>
+      <w:pPr>
+        <w:rPr>
+          <w:rFonts w:hint="default"/>
+          <w:lang w:val="en-US"/>
+        </w:rPr>
+      </w:pPr>
+      <w:r>
+        <w:rPr>
+          <w:rFonts w:hint="default"/>
+          <w:lang w:val="en-US"/>
+        </w:rPr>
+        <w:br w:type="page"/>
+      </w:r>
+    </w:p>
+    <w:p>
+      <w:pPr>
+        <w:pStyle w:val="10"/>
+        <w:keepNext w:val="0"/>
+        <w:keepLines w:val="0"/>
+        <w:widowControl/>
+        <w:suppressLineNumbers w:val="0"/>
+        <w:pBdr>
+          <w:top w:val="none" w:color="1F1F1F" w:sz="0" w:space="0"/>
+          <w:left w:val="none" w:color="1F1F1F" w:sz="0" w:space="0"/>
+          <w:bottom w:val="none" w:color="1F1F1F" w:sz="0" w:space="0"/>
+          <w:right w:val="none" w:color="1F1F1F" w:sz="0" w:space="0"/>
+        </w:pBdr>
+        <w:bidi w:val="0"/>
+        <w:spacing w:before="0" w:beforeAutospacing="0" w:after="120" w:afterAutospacing="0" w:line="14" w:lineRule="atLeast"/>
+        <w:ind w:left="0" w:right="0"/>
+        <w:rPr>
+          <w:rStyle w:val="21"/>
+          <w:rFonts w:hint="default"/>
+        </w:rPr>
+      </w:pPr>
+      <w:bookmarkStart w:id="83" w:name="_Toc25314"/>
+      <w:r>
+        <w:rPr>
+          <w:rStyle w:val="24"/>
+          <w:rFonts w:hint="default"/>
+          <w:lang w:val="vi-VN"/>
+        </w:rPr>
+        <w:t>Các lệnh của git:</w:t>
+      </w:r>
+      <w:bookmarkEnd w:id="83"/>
+      <w:r>
+        <w:rPr>
+          <w:rFonts w:hint="default"/>
+          <w:lang w:val="vi-VN"/>
+        </w:rPr>
+        <w:br w:type="textWrapping"/>
+      </w:r>
+      <w:r>
+        <w:rPr>
+          <w:rStyle w:val="21"/>
+          <w:rFonts w:hint="default"/>
+        </w:rPr>
+        <w:t>Để làm việc với Git hiệu quả, bạn cần nắm vững các nhóm lệnh từ cơ bản đến nâng cao. Dưới đây là bảng tổng hợp các lệnh quan trọng nhất:</w:t>
+      </w:r>
+    </w:p>
+    <w:p>
+      <w:pPr>
+        <w:pStyle w:val="10"/>
+        <w:keepNext w:val="0"/>
+        <w:keepLines w:val="0"/>
+        <w:widowControl/>
+        <w:suppressLineNumbers w:val="0"/>
+        <w:pBdr>
+          <w:top w:val="none" w:color="1F1F1F" w:sz="0" w:space="0"/>
+          <w:left w:val="none" w:color="1F1F1F" w:sz="0" w:space="0"/>
+          <w:bottom w:val="none" w:color="1F1F1F" w:sz="0" w:space="0"/>
+          <w:right w:val="none" w:color="1F1F1F" w:sz="0" w:space="0"/>
+        </w:pBdr>
+        <w:bidi w:val="0"/>
+        <w:spacing w:before="0" w:beforeAutospacing="0" w:after="120" w:afterAutospacing="0" w:line="14" w:lineRule="atLeast"/>
+        <w:ind w:left="0" w:right="0"/>
+        <w:rPr>
+          <w:rStyle w:val="21"/>
+          <w:rFonts w:hint="default"/>
+        </w:rPr>
+      </w:pPr>
+    </w:p>
+    <w:p>
+      <w:pPr>
+        <w:pStyle w:val="17"/>
+        <w:numPr>
+          <w:ilvl w:val="0"/>
+          <w:numId w:val="1"/>
+        </w:numPr>
+        <w:bidi w:val="0"/>
+        <w:spacing w:line="312" w:lineRule="auto"/>
+        <w:ind w:left="625" w:leftChars="0" w:hanging="425" w:firstLineChars="0"/>
+        <w:rPr>
+          <w:rFonts w:hint="default"/>
+          <w:lang w:val="vi-VN"/>
+        </w:rPr>
+      </w:pPr>
+      <w:bookmarkStart w:id="84" w:name="_Toc30315"/>
+      <w:bookmarkStart w:id="85" w:name="_Toc24424"/>
+      <w:r>
+        <w:rPr>
+          <w:rFonts w:hint="default"/>
+        </w:rPr>
+        <w:t>Khởi tạo và Cấu hình</w:t>
+      </w:r>
+      <w:bookmarkEnd w:id="84"/>
+      <w:bookmarkEnd w:id="85"/>
     </w:p>
     <w:p>
       <w:pPr>
@@ -2261,9 +2633,14 @@
         <w:bidi w:val="0"/>
         <w:rPr>
           <w:rFonts w:hint="default"/>
-          <w:lang w:val="en-US"/>
-        </w:rPr>
-      </w:pPr>
+        </w:rPr>
+      </w:pPr>
+      <w:r>
+        <w:rPr>
+          <w:rFonts w:hint="default"/>
+        </w:rPr>
+        <w:t>Đây là bước đầu tiên để Git biết bạn là ai và thiết lập môi trường làm việc.</w:t>
+      </w:r>
     </w:p>
     <w:p>
       <w:pPr>
@@ -2271,9 +2648,749 @@
         <w:bidi w:val="0"/>
         <w:rPr>
           <w:rFonts w:hint="default"/>
-          <w:lang w:val="en-US"/>
-        </w:rPr>
-      </w:pPr>
+        </w:rPr>
+      </w:pPr>
+      <w:r>
+        <w:rPr>
+          <w:rFonts w:hint="default"/>
+        </w:rPr>
+        <w:t>git init: Khởi tạo một Git repository trống ngay tại thư mục hiện hành.</w:t>
+      </w:r>
+    </w:p>
+    <w:p>
+      <w:pPr>
+        <w:pStyle w:val="16"/>
+        <w:bidi w:val="0"/>
+        <w:rPr>
+          <w:rFonts w:hint="default"/>
+        </w:rPr>
+      </w:pPr>
+      <w:r>
+        <w:rPr>
+          <w:rFonts w:hint="default"/>
+        </w:rPr>
+        <w:t>git config --global user.name "Tên Của Bạn": Thiết lập tên hiển thị của bạn khi commit.</w:t>
+      </w:r>
+    </w:p>
+    <w:p>
+      <w:pPr>
+        <w:pStyle w:val="16"/>
+        <w:bidi w:val="0"/>
+        <w:rPr>
+          <w:rFonts w:hint="default"/>
+        </w:rPr>
+      </w:pPr>
+      <w:r>
+        <w:rPr>
+          <w:rFonts w:hint="default"/>
+        </w:rPr>
+        <w:t>git config --global user.email "email@example.com": Thiết lập email liên kết với các commit của bạn.</w:t>
+      </w:r>
+    </w:p>
+    <w:p>
+      <w:pPr>
+        <w:pStyle w:val="16"/>
+        <w:bidi w:val="0"/>
+        <w:rPr>
+          <w:rFonts w:hint="default"/>
+        </w:rPr>
+      </w:pPr>
+      <w:r>
+        <w:rPr>
+          <w:rFonts w:hint="default"/>
+        </w:rPr>
+        <w:t>git clone [url]: Sao chép một repository từ xa (như GitHub, GitLab) về máy tính cá nhân.</w:t>
+      </w:r>
+    </w:p>
+    <w:p>
+      <w:pPr>
+        <w:keepNext w:val="0"/>
+        <w:keepLines w:val="0"/>
+        <w:widowControl/>
+        <w:numPr>
+          <w:ilvl w:val="0"/>
+          <w:numId w:val="2"/>
+        </w:numPr>
+        <w:suppressLineNumbers w:val="0"/>
+        <w:pBdr>
+          <w:top w:val="none" w:color="1F1F1F" w:sz="0" w:space="0"/>
+          <w:left w:val="none" w:color="1F1F1F" w:sz="0" w:space="0"/>
+          <w:bottom w:val="none" w:color="1F1F1F" w:sz="0" w:space="0"/>
+          <w:right w:val="none" w:color="1F1F1F" w:sz="0" w:space="0"/>
+        </w:pBdr>
+        <w:bidi w:val="0"/>
+        <w:spacing w:before="0" w:beforeAutospacing="0" w:after="96" w:afterAutospacing="0" w:line="14" w:lineRule="atLeast"/>
+        <w:ind w:left="0" w:right="0" w:hanging="360"/>
+        <w:rPr>
+          <w:rFonts w:hint="default" w:ascii="sans-serif" w:hAnsi="sans-serif" w:eastAsia="sans-serif" w:cs="sans-serif"/>
+          <w:color w:val="1F1F1F"/>
+        </w:rPr>
+      </w:pPr>
+    </w:p>
+    <w:p>
+      <w:pPr>
+        <w:keepNext w:val="0"/>
+        <w:keepLines w:val="0"/>
+        <w:widowControl/>
+        <w:suppressLineNumbers w:val="0"/>
+        <w:pBdr>
+          <w:top w:val="none" w:color="auto" w:sz="0" w:space="0"/>
+          <w:left w:val="none" w:color="auto" w:sz="0" w:space="0"/>
+          <w:bottom w:val="none" w:color="auto" w:sz="0" w:space="0"/>
+          <w:right w:val="none" w:color="auto" w:sz="0" w:space="0"/>
+        </w:pBdr>
+        <w:bidi w:val="0"/>
+        <w:spacing w:before="0" w:beforeAutospacing="0" w:after="96" w:afterAutospacing="0" w:line="14" w:lineRule="atLeast"/>
+        <w:ind w:left="0" w:right="0"/>
+        <w:rPr>
+          <w:rFonts w:hint="default" w:ascii="sans-serif" w:hAnsi="sans-serif" w:eastAsia="sans-serif" w:cs="sans-serif"/>
+          <w:color w:val="808080"/>
+        </w:rPr>
+      </w:pPr>
+      <w:r>
+        <w:rPr>
+          <w:rFonts w:hint="default" w:ascii="sans-serif" w:hAnsi="sans-serif" w:eastAsia="sans-serif" w:cs="sans-serif"/>
+          <w:color w:val="1F1F1F"/>
+        </w:rPr>
+        <w:pict>
+          <v:rect id="_x0000_i1033" o:spt="1" style="height:1.5pt;width:432pt;" fillcolor="#808080" filled="t" stroked="f" coordsize="21600,21600" o:hr="t" o:hrstd="t" o:hrnoshade="t" o:hralign="center">
+            <v:path/>
+            <v:fill on="t" focussize="0,0"/>
+            <v:stroke on="f"/>
+            <v:imagedata o:title=""/>
+            <o:lock v:ext="edit"/>
+            <w10:wrap type="none"/>
+            <w10:anchorlock/>
+          </v:rect>
+        </w:pict>
+      </w:r>
+    </w:p>
+    <w:p>
+      <w:pPr>
+        <w:pStyle w:val="17"/>
+        <w:numPr>
+          <w:ilvl w:val="0"/>
+          <w:numId w:val="1"/>
+        </w:numPr>
+        <w:bidi w:val="0"/>
+        <w:spacing w:line="312" w:lineRule="auto"/>
+        <w:ind w:left="625" w:leftChars="0" w:hanging="425" w:firstLineChars="0"/>
+        <w:rPr>
+          <w:rFonts w:hint="default"/>
+        </w:rPr>
+      </w:pPr>
+      <w:bookmarkStart w:id="86" w:name="_Toc20907"/>
+      <w:bookmarkStart w:id="87" w:name="_Toc2245"/>
+      <w:r>
+        <w:rPr>
+          <w:rFonts w:hint="default"/>
+        </w:rPr>
+        <w:t xml:space="preserve">Luồng </w:t>
+      </w:r>
+      <w:r>
+        <w:rPr>
+          <w:rFonts w:hint="default"/>
+        </w:rPr>
+        <w:t>công việc cơ bản (The Basic Workflow)</w:t>
+      </w:r>
+      <w:bookmarkEnd w:id="86"/>
+      <w:bookmarkEnd w:id="87"/>
+    </w:p>
+    <w:p>
+      <w:pPr>
+        <w:pStyle w:val="16"/>
+        <w:bidi w:val="0"/>
+        <w:rPr>
+          <w:rFonts w:hint="default"/>
+        </w:rPr>
+      </w:pPr>
+      <w:r>
+        <w:rPr>
+          <w:rFonts w:hint="default"/>
+        </w:rPr>
+        <w:t>Sử dụng các lệnh này hàng ngày để lưu lại các thay đổi trong mã nguồn.</w:t>
+      </w:r>
+    </w:p>
+    <w:p>
+      <w:pPr>
+        <w:pStyle w:val="16"/>
+        <w:bidi w:val="0"/>
+        <w:rPr>
+          <w:rFonts w:hint="default"/>
+        </w:rPr>
+      </w:pPr>
+      <w:r>
+        <w:rPr>
+          <w:rFonts w:hint="default"/>
+        </w:rPr>
+        <w:t>git status: Kiểm tra trạng thái của các tệp (tệp nào đã sửa, tệp nào đang chờ commit).</w:t>
+      </w:r>
+    </w:p>
+    <w:p>
+      <w:pPr>
+        <w:pStyle w:val="16"/>
+        <w:bidi w:val="0"/>
+        <w:rPr>
+          <w:rFonts w:hint="default"/>
+        </w:rPr>
+      </w:pPr>
+      <w:r>
+        <w:rPr>
+          <w:rFonts w:hint="default"/>
+        </w:rPr>
+        <w:t>git add [tên_file]: Đưa tệp cụ thể vào vùng chờ (Staging Area).</w:t>
+      </w:r>
+    </w:p>
+    <w:p>
+      <w:pPr>
+        <w:pStyle w:val="16"/>
+        <w:bidi w:val="0"/>
+        <w:rPr>
+          <w:rFonts w:hint="default"/>
+        </w:rPr>
+      </w:pPr>
+      <w:r>
+        <w:rPr>
+          <w:rFonts w:hint="default"/>
+        </w:rPr>
+        <w:t>git add .: Đưa toàn bộ các thay đổi hiện tại vào vùng chờ.</w:t>
+      </w:r>
+    </w:p>
+    <w:p>
+      <w:pPr>
+        <w:pStyle w:val="16"/>
+        <w:bidi w:val="0"/>
+        <w:rPr>
+          <w:rFonts w:hint="default"/>
+        </w:rPr>
+      </w:pPr>
+      <w:r>
+        <w:rPr>
+          <w:rFonts w:hint="default"/>
+        </w:rPr>
+        <w:t>git commit -m "Thông điệp commit": Lưu vĩnh viễn các thay đổi từ vùng chờ vào lịch sử của repository kèm theo mô tả.</w:t>
+      </w:r>
+    </w:p>
+    <w:p>
+      <w:pPr>
+        <w:pStyle w:val="16"/>
+        <w:bidi w:val="0"/>
+        <w:rPr>
+          <w:rFonts w:hint="default"/>
+        </w:rPr>
+      </w:pPr>
+      <w:r>
+        <w:rPr>
+          <w:rFonts w:hint="default"/>
+        </w:rPr>
+        <w:t>git log: Xem lại lịch sử các bản commit đã thực hiện.</w:t>
+      </w:r>
+    </w:p>
+    <w:p>
+      <w:pPr>
+        <w:pStyle w:val="16"/>
+        <w:bidi w:val="0"/>
+        <w:ind w:left="0" w:leftChars="0" w:firstLine="0" w:firstLineChars="0"/>
+        <w:rPr>
+          <w:rFonts w:hint="default"/>
+        </w:rPr>
+      </w:pPr>
+    </w:p>
+    <w:p>
+      <w:pPr>
+        <w:keepNext w:val="0"/>
+        <w:keepLines w:val="0"/>
+        <w:widowControl/>
+        <w:suppressLineNumbers w:val="0"/>
+        <w:pBdr>
+          <w:top w:val="none" w:color="auto" w:sz="0" w:space="0"/>
+          <w:left w:val="none" w:color="auto" w:sz="0" w:space="0"/>
+          <w:bottom w:val="none" w:color="auto" w:sz="0" w:space="0"/>
+          <w:right w:val="none" w:color="auto" w:sz="0" w:space="0"/>
+        </w:pBdr>
+        <w:bidi w:val="0"/>
+        <w:spacing w:before="0" w:beforeAutospacing="0" w:after="96" w:afterAutospacing="0" w:line="14" w:lineRule="atLeast"/>
+        <w:ind w:left="0" w:right="0"/>
+        <w:rPr>
+          <w:rFonts w:hint="default" w:ascii="sans-serif" w:hAnsi="sans-serif" w:eastAsia="sans-serif" w:cs="sans-serif"/>
+          <w:color w:val="808080"/>
+        </w:rPr>
+      </w:pPr>
+      <w:r>
+        <w:rPr>
+          <w:rFonts w:hint="default" w:ascii="sans-serif" w:hAnsi="sans-serif" w:eastAsia="sans-serif" w:cs="sans-serif"/>
+          <w:color w:val="1F1F1F"/>
+        </w:rPr>
+        <w:pict>
+          <v:rect id="_x0000_i1034" o:spt="1" style="height:1.5pt;width:432pt;" fillcolor="#808080" filled="t" stroked="f" coordsize="21600,21600" o:hr="t" o:hrstd="t" o:hrnoshade="t" o:hralign="center">
+            <v:path/>
+            <v:fill on="t" focussize="0,0"/>
+            <v:stroke on="f"/>
+            <v:imagedata o:title=""/>
+            <o:lock v:ext="edit"/>
+            <w10:wrap type="none"/>
+            <w10:anchorlock/>
+          </v:rect>
+        </w:pict>
+      </w:r>
+    </w:p>
+    <w:p>
+      <w:pPr>
+        <w:pStyle w:val="17"/>
+        <w:numPr>
+          <w:ilvl w:val="0"/>
+          <w:numId w:val="1"/>
+        </w:numPr>
+        <w:bidi w:val="0"/>
+        <w:spacing w:line="312" w:lineRule="auto"/>
+        <w:ind w:left="625" w:leftChars="0" w:hanging="425" w:firstLineChars="0"/>
+        <w:rPr>
+          <w:rFonts w:hint="default"/>
+        </w:rPr>
+      </w:pPr>
+      <w:bookmarkStart w:id="88" w:name="_Toc2370"/>
+      <w:bookmarkStart w:id="89" w:name="_Toc6545"/>
+      <w:r>
+        <w:rPr>
+          <w:rFonts w:hint="default"/>
+        </w:rPr>
+        <w:t xml:space="preserve">Quản </w:t>
+      </w:r>
+      <w:r>
+        <w:rPr>
+          <w:rFonts w:hint="default"/>
+        </w:rPr>
+        <w:t>lý Nhánh (Branching)</w:t>
+      </w:r>
+      <w:bookmarkEnd w:id="88"/>
+      <w:bookmarkEnd w:id="89"/>
+    </w:p>
+    <w:p>
+      <w:pPr>
+        <w:pStyle w:val="16"/>
+        <w:bidi w:val="0"/>
+        <w:rPr>
+          <w:rFonts w:hint="default"/>
+        </w:rPr>
+      </w:pPr>
+      <w:r>
+        <w:rPr>
+          <w:rFonts w:hint="default"/>
+        </w:rPr>
+        <w:t>Làm việc với nhánh giúp bạn phát triển tính năng mới mà không ảnh hưởng đến mã nguồn chính.</w:t>
+      </w:r>
+    </w:p>
+    <w:p>
+      <w:pPr>
+        <w:pStyle w:val="16"/>
+        <w:bidi w:val="0"/>
+        <w:rPr>
+          <w:rFonts w:hint="default"/>
+        </w:rPr>
+      </w:pPr>
+      <w:r>
+        <w:rPr>
+          <w:rFonts w:hint="default"/>
+        </w:rPr>
+        <w:t>git branch: Liệt kê danh sách các nhánh đang có.</w:t>
+      </w:r>
+    </w:p>
+    <w:p>
+      <w:pPr>
+        <w:pStyle w:val="16"/>
+        <w:bidi w:val="0"/>
+        <w:rPr>
+          <w:rFonts w:hint="default"/>
+        </w:rPr>
+      </w:pPr>
+      <w:r>
+        <w:rPr>
+          <w:rFonts w:hint="default"/>
+        </w:rPr>
+        <w:t>git branch [tên_nhánh]: Tạo một nhánh mới.</w:t>
+      </w:r>
+    </w:p>
+    <w:p>
+      <w:pPr>
+        <w:pStyle w:val="16"/>
+        <w:bidi w:val="0"/>
+        <w:rPr>
+          <w:rFonts w:hint="default"/>
+        </w:rPr>
+      </w:pPr>
+      <w:r>
+        <w:rPr>
+          <w:rFonts w:hint="default"/>
+        </w:rPr>
+        <w:t>git checkout [tên_nhánh]: Chuyển sang làm việc trên nhánh được chỉ định.</w:t>
+      </w:r>
+    </w:p>
+    <w:p>
+      <w:pPr>
+        <w:pStyle w:val="16"/>
+        <w:bidi w:val="0"/>
+        <w:rPr>
+          <w:rFonts w:hint="default"/>
+        </w:rPr>
+      </w:pPr>
+      <w:r>
+        <w:rPr>
+          <w:rFonts w:hint="default"/>
+        </w:rPr>
+        <w:t>git checkout -b [tên_nhánh]: Phím tắt để vừa tạo nhánh mới vừa chuyển sang nhánh đó ngay lập tức.</w:t>
+      </w:r>
+    </w:p>
+    <w:p>
+      <w:pPr>
+        <w:pStyle w:val="16"/>
+        <w:bidi w:val="0"/>
+        <w:rPr>
+          <w:rFonts w:hint="default"/>
+        </w:rPr>
+      </w:pPr>
+      <w:r>
+        <w:rPr>
+          <w:rFonts w:hint="default"/>
+        </w:rPr>
+        <w:t>git merge [tên_nhánh]: Hợp nhất nội dung của nhánh được chỉ định vào nhánh hiện tại.</w:t>
+      </w:r>
+    </w:p>
+    <w:p>
+      <w:pPr>
+        <w:pStyle w:val="16"/>
+        <w:bidi w:val="0"/>
+        <w:rPr>
+          <w:rFonts w:hint="default"/>
+        </w:rPr>
+      </w:pPr>
+      <w:r>
+        <w:rPr>
+          <w:rFonts w:hint="default"/>
+        </w:rPr>
+        <w:t>git branch -d [tên_nhánh]: Xóa một nhánh đã hoàn thành nhiệm vụ.</w:t>
+      </w:r>
+    </w:p>
+    <w:p>
+      <w:pPr>
+        <w:pStyle w:val="16"/>
+        <w:bidi w:val="0"/>
+        <w:rPr>
+          <w:rFonts w:hint="default"/>
+        </w:rPr>
+      </w:pPr>
+    </w:p>
+    <w:p>
+      <w:pPr>
+        <w:keepNext w:val="0"/>
+        <w:keepLines w:val="0"/>
+        <w:widowControl/>
+        <w:suppressLineNumbers w:val="0"/>
+        <w:pBdr>
+          <w:top w:val="none" w:color="auto" w:sz="0" w:space="0"/>
+          <w:left w:val="none" w:color="auto" w:sz="0" w:space="0"/>
+          <w:bottom w:val="none" w:color="auto" w:sz="0" w:space="0"/>
+          <w:right w:val="none" w:color="auto" w:sz="0" w:space="0"/>
+        </w:pBdr>
+        <w:bidi w:val="0"/>
+        <w:spacing w:before="0" w:beforeAutospacing="0" w:after="96" w:afterAutospacing="0" w:line="14" w:lineRule="atLeast"/>
+        <w:ind w:left="0" w:right="0"/>
+        <w:rPr>
+          <w:rFonts w:hint="default" w:ascii="sans-serif" w:hAnsi="sans-serif" w:eastAsia="sans-serif" w:cs="sans-serif"/>
+          <w:color w:val="808080"/>
+        </w:rPr>
+      </w:pPr>
+      <w:r>
+        <w:rPr>
+          <w:rFonts w:hint="default" w:ascii="sans-serif" w:hAnsi="sans-serif" w:eastAsia="sans-serif" w:cs="sans-serif"/>
+          <w:color w:val="1F1F1F"/>
+        </w:rPr>
+        <w:pict>
+          <v:rect id="_x0000_i1035" o:spt="1" style="height:1.5pt;width:432pt;" fillcolor="#808080" filled="t" stroked="f" coordsize="21600,21600" o:hr="t" o:hrstd="t" o:hrnoshade="t" o:hralign="center">
+            <v:path/>
+            <v:fill on="t" focussize="0,0"/>
+            <v:stroke on="f"/>
+            <v:imagedata o:title=""/>
+            <o:lock v:ext="edit"/>
+            <w10:wrap type="none"/>
+            <w10:anchorlock/>
+          </v:rect>
+        </w:pict>
+      </w:r>
+    </w:p>
+    <w:p>
+      <w:pPr>
+        <w:pStyle w:val="17"/>
+        <w:numPr>
+          <w:ilvl w:val="0"/>
+          <w:numId w:val="1"/>
+        </w:numPr>
+        <w:bidi w:val="0"/>
+        <w:spacing w:line="312" w:lineRule="auto"/>
+        <w:ind w:left="625" w:leftChars="0" w:hanging="425" w:firstLineChars="0"/>
+        <w:rPr>
+          <w:rFonts w:hint="default"/>
+        </w:rPr>
+      </w:pPr>
+      <w:bookmarkStart w:id="90" w:name="_Toc30889"/>
+      <w:bookmarkStart w:id="91" w:name="_Toc17267"/>
+      <w:r>
+        <w:rPr>
+          <w:rFonts w:hint="default"/>
+        </w:rPr>
+        <w:t xml:space="preserve"> </w:t>
+      </w:r>
+      <w:r>
+        <w:rPr>
+          <w:rFonts w:hint="default"/>
+        </w:rPr>
+        <w:t>Đồng bộ với Remote Repository</w:t>
+      </w:r>
+      <w:bookmarkEnd w:id="90"/>
+      <w:bookmarkEnd w:id="91"/>
+    </w:p>
+    <w:p>
+      <w:pPr>
+        <w:pStyle w:val="16"/>
+        <w:bidi w:val="0"/>
+        <w:rPr>
+          <w:rFonts w:hint="default"/>
+        </w:rPr>
+      </w:pPr>
+      <w:r>
+        <w:rPr>
+          <w:rFonts w:hint="default"/>
+        </w:rPr>
+        <w:t>Các lệnh này dùng để chia sẻ code với đồng nghiệp hoặc lưu trữ trên đám mây.</w:t>
+      </w:r>
+    </w:p>
+    <w:p>
+      <w:pPr>
+        <w:pStyle w:val="16"/>
+        <w:bidi w:val="0"/>
+        <w:rPr>
+          <w:rFonts w:hint="default"/>
+        </w:rPr>
+      </w:pPr>
+      <w:r>
+        <w:rPr>
+          <w:rFonts w:hint="default"/>
+        </w:rPr>
+        <w:t>git remote add origin [url]: Kết nối repository cục bộ với một server từ xa.</w:t>
+      </w:r>
+    </w:p>
+    <w:p>
+      <w:pPr>
+        <w:pStyle w:val="16"/>
+        <w:bidi w:val="0"/>
+        <w:rPr>
+          <w:rFonts w:hint="default"/>
+        </w:rPr>
+      </w:pPr>
+      <w:r>
+        <w:rPr>
+          <w:rFonts w:hint="default"/>
+        </w:rPr>
+        <w:t>git push origin [tên_nhánh]: Đẩy các commit từ máy cục bộ lên server.</w:t>
+      </w:r>
+    </w:p>
+    <w:p>
+      <w:pPr>
+        <w:pStyle w:val="16"/>
+        <w:bidi w:val="0"/>
+        <w:rPr>
+          <w:rFonts w:hint="default"/>
+        </w:rPr>
+      </w:pPr>
+      <w:r>
+        <w:rPr>
+          <w:rFonts w:hint="default"/>
+        </w:rPr>
+        <w:t>git pull: Tải về và hợp nhất các thay đổi từ server về máy cục bộ (tương đương với fetch + merge).</w:t>
+      </w:r>
+    </w:p>
+    <w:p>
+      <w:pPr>
+        <w:pStyle w:val="16"/>
+        <w:bidi w:val="0"/>
+        <w:rPr>
+          <w:rFonts w:hint="default" w:ascii="sans-serif" w:hAnsi="sans-serif" w:eastAsia="sans-serif" w:cs="sans-serif"/>
+          <w:color w:val="1F1F1F"/>
+        </w:rPr>
+      </w:pPr>
+      <w:r>
+        <w:rPr>
+          <w:rFonts w:hint="default"/>
+        </w:rPr>
+        <w:t>git fetch: Chỉ tải về thông tin các thay đổi mới nhất từ server nhưng chưa ghi đè vào code hiện tại của bạn.</w:t>
+      </w:r>
+    </w:p>
+    <w:p>
+      <w:pPr>
+        <w:keepNext w:val="0"/>
+        <w:keepLines w:val="0"/>
+        <w:widowControl/>
+        <w:suppressLineNumbers w:val="0"/>
+        <w:pBdr>
+          <w:top w:val="none" w:color="auto" w:sz="0" w:space="0"/>
+          <w:left w:val="none" w:color="auto" w:sz="0" w:space="0"/>
+          <w:bottom w:val="none" w:color="auto" w:sz="0" w:space="0"/>
+          <w:right w:val="none" w:color="auto" w:sz="0" w:space="0"/>
+        </w:pBdr>
+        <w:bidi w:val="0"/>
+        <w:spacing w:before="0" w:beforeAutospacing="0" w:after="96" w:afterAutospacing="0" w:line="14" w:lineRule="atLeast"/>
+        <w:ind w:left="0" w:right="0"/>
+        <w:rPr>
+          <w:rFonts w:hint="default" w:ascii="sans-serif" w:hAnsi="sans-serif" w:eastAsia="sans-serif" w:cs="sans-serif"/>
+          <w:color w:val="808080"/>
+        </w:rPr>
+      </w:pPr>
+      <w:r>
+        <w:rPr>
+          <w:rFonts w:hint="default" w:ascii="sans-serif" w:hAnsi="sans-serif" w:eastAsia="sans-serif" w:cs="sans-serif"/>
+          <w:color w:val="1F1F1F"/>
+        </w:rPr>
+        <w:pict>
+          <v:rect id="_x0000_i1036" o:spt="1" style="height:1.5pt;width:432pt;" fillcolor="#808080" filled="t" stroked="f" coordsize="21600,21600" o:hr="t" o:hrstd="t" o:hrnoshade="t" o:hralign="center">
+            <v:path/>
+            <v:fill on="t" focussize="0,0"/>
+            <v:stroke on="f"/>
+            <v:imagedata o:title=""/>
+            <o:lock v:ext="edit"/>
+            <w10:wrap type="none"/>
+            <w10:anchorlock/>
+          </v:rect>
+        </w:pict>
+      </w:r>
+    </w:p>
+    <w:p>
+      <w:pPr>
+        <w:pStyle w:val="17"/>
+        <w:numPr>
+          <w:ilvl w:val="0"/>
+          <w:numId w:val="1"/>
+        </w:numPr>
+        <w:bidi w:val="0"/>
+        <w:spacing w:line="312" w:lineRule="auto"/>
+        <w:ind w:left="625" w:leftChars="0" w:hanging="425" w:firstLineChars="0"/>
+        <w:rPr>
+          <w:rFonts w:hint="default"/>
+        </w:rPr>
+      </w:pPr>
+      <w:bookmarkStart w:id="92" w:name="_Toc20834"/>
+      <w:bookmarkStart w:id="93" w:name="_Toc26672"/>
+      <w:r>
+        <w:rPr>
+          <w:rFonts w:hint="default"/>
+        </w:rPr>
+        <w:t>Hoàn</w:t>
+      </w:r>
+      <w:bookmarkStart w:id="94" w:name="_GoBack"/>
+      <w:bookmarkEnd w:id="94"/>
+      <w:r>
+        <w:rPr>
+          <w:rFonts w:hint="default"/>
+        </w:rPr>
+        <w:t xml:space="preserve"> </w:t>
+      </w:r>
+      <w:r>
+        <w:rPr>
+          <w:rFonts w:hint="default"/>
+        </w:rPr>
+        <w:t>tác và Sửa lỗi (Undo)</w:t>
+      </w:r>
+      <w:bookmarkEnd w:id="92"/>
+      <w:bookmarkEnd w:id="93"/>
+    </w:p>
+    <w:p>
+      <w:pPr>
+        <w:pStyle w:val="16"/>
+        <w:bidi w:val="0"/>
+        <w:rPr>
+          <w:rFonts w:hint="default"/>
+        </w:rPr>
+      </w:pPr>
+      <w:r>
+        <w:rPr>
+          <w:rFonts w:hint="default"/>
+        </w:rPr>
+        <w:t>Khi bạn lỡ tay làm sai, Git cung cấp các công cụ để quay lại quá trình trước đó.</w:t>
+      </w:r>
+    </w:p>
+    <w:p>
+      <w:pPr>
+        <w:pStyle w:val="16"/>
+        <w:bidi w:val="0"/>
+        <w:rPr>
+          <w:rFonts w:hint="default"/>
+        </w:rPr>
+      </w:pPr>
+      <w:r>
+        <w:rPr>
+          <w:rFonts w:hint="default"/>
+        </w:rPr>
+        <w:t>git checkout -- [tên_file]: Hủy bỏ các thay đổi chưa commit của một tệp, đưa nó về trạng thái của lần commit gần nhất.</w:t>
+      </w:r>
+    </w:p>
+    <w:p>
+      <w:pPr>
+        <w:pStyle w:val="16"/>
+        <w:bidi w:val="0"/>
+        <w:rPr>
+          <w:rFonts w:hint="default"/>
+        </w:rPr>
+      </w:pPr>
+      <w:r>
+        <w:rPr>
+          <w:rFonts w:hint="default"/>
+        </w:rPr>
+        <w:t>git reset --soft HEAD~1: Hủy bỏ commit gần nhất nhưng vẫn giữ lại các thay đổi trong code để bạn sửa lại.</w:t>
+      </w:r>
+    </w:p>
+    <w:p>
+      <w:pPr>
+        <w:pStyle w:val="16"/>
+        <w:bidi w:val="0"/>
+        <w:rPr>
+          <w:rFonts w:hint="default"/>
+        </w:rPr>
+      </w:pPr>
+      <w:r>
+        <w:rPr>
+          <w:rFonts w:hint="default"/>
+        </w:rPr>
+        <w:t>git reset --hard HEAD~1: Xóa bỏ hoàn toàn commit gần nhất và tất cả thay đổi liên quan (thận trọng khi dùng!).</w:t>
+      </w:r>
+    </w:p>
+    <w:p>
+      <w:pPr>
+        <w:pStyle w:val="16"/>
+        <w:bidi w:val="0"/>
+        <w:rPr>
+          <w:rFonts w:hint="default"/>
+        </w:rPr>
+      </w:pPr>
+      <w:r>
+        <w:rPr>
+          <w:rFonts w:hint="default"/>
+        </w:rPr>
+        <w:t>git stash: Tạm thời cất các thay đổi đang làm dở vào một "ngăn kéo" để bạn có thể chuyển sang nhánh khác mà không cần commit.</w:t>
+      </w:r>
+    </w:p>
+    <w:p>
+      <w:pPr>
+        <w:pStyle w:val="16"/>
+        <w:bidi w:val="0"/>
+        <w:rPr>
+          <w:rFonts w:hint="default"/>
+          <w:lang w:val="vi-VN"/>
+        </w:rPr>
+      </w:pPr>
+      <w:r>
+        <w:rPr>
+          <w:rFonts w:hint="default"/>
+        </w:rPr>
+        <w:t>git stash pop: Lấy các thay đổi từ "ngăn kéo" ra để tiếp tục làm việc.</w:t>
+      </w:r>
     </w:p>
     <w:sectPr>
       <w:headerReference r:id="rId3" w:type="default"/>
@@ -2631,8 +3748,160 @@
       </w:rPr>
     </w:lvl>
   </w:abstractNum>
+  <w:abstractNum w:abstractNumId="1">
+    <w:nsid w:val="7D5D298B"/>
+    <w:multiLevelType w:val="multilevel"/>
+    <w:tmpl w:val="7D5D298B"/>
+    <w:lvl w:ilvl="0" w:tentative="0">
+      <w:start w:val="1"/>
+      <w:numFmt w:val="bullet"/>
+      <w:lvlText w:val=""/>
+      <w:lvlJc w:val="left"/>
+      <w:pPr>
+        <w:tabs>
+          <w:tab w:val="left" w:pos="720"/>
+        </w:tabs>
+        <w:ind w:left="720" w:hanging="360"/>
+      </w:pPr>
+      <w:rPr>
+        <w:rFonts w:ascii="Symbol" w:hAnsi="Symbol" w:cs="Symbol"/>
+        <w:sz w:val="20"/>
+      </w:rPr>
+    </w:lvl>
+    <w:lvl w:ilvl="1" w:tentative="0">
+      <w:start w:val="1"/>
+      <w:numFmt w:val="bullet"/>
+      <w:lvlText w:val="o"/>
+      <w:lvlJc w:val="left"/>
+      <w:pPr>
+        <w:tabs>
+          <w:tab w:val="left" w:pos="1440"/>
+        </w:tabs>
+        <w:ind w:left="1440" w:hanging="360"/>
+      </w:pPr>
+      <w:rPr>
+        <w:rFonts w:ascii="Courier New" w:hAnsi="Courier New" w:cs="Courier New"/>
+        <w:sz w:val="20"/>
+      </w:rPr>
+    </w:lvl>
+    <w:lvl w:ilvl="2" w:tentative="0">
+      <w:start w:val="1"/>
+      <w:numFmt w:val="bullet"/>
+      <w:lvlText w:val=""/>
+      <w:lvlJc w:val="left"/>
+      <w:pPr>
+        <w:tabs>
+          <w:tab w:val="left" w:pos="2160"/>
+        </w:tabs>
+        <w:ind w:left="2160" w:hanging="360"/>
+      </w:pPr>
+      <w:rPr>
+        <w:rFonts w:ascii="Wingdings" w:hAnsi="Wingdings" w:cs="Wingdings"/>
+        <w:sz w:val="20"/>
+      </w:rPr>
+    </w:lvl>
+    <w:lvl w:ilvl="3" w:tentative="0">
+      <w:start w:val="1"/>
+      <w:numFmt w:val="bullet"/>
+      <w:lvlText w:val=""/>
+      <w:lvlJc w:val="left"/>
+      <w:pPr>
+        <w:tabs>
+          <w:tab w:val="left" w:pos="2880"/>
+        </w:tabs>
+        <w:ind w:left="2880" w:hanging="360"/>
+      </w:pPr>
+      <w:rPr>
+        <w:rFonts w:hint="default" w:ascii="Wingdings" w:hAnsi="Wingdings" w:cs="Wingdings"/>
+        <w:sz w:val="20"/>
+      </w:rPr>
+    </w:lvl>
+    <w:lvl w:ilvl="4" w:tentative="0">
+      <w:start w:val="1"/>
+      <w:numFmt w:val="bullet"/>
+      <w:lvlText w:val=""/>
+      <w:lvlJc w:val="left"/>
+      <w:pPr>
+        <w:tabs>
+          <w:tab w:val="left" w:pos="3600"/>
+        </w:tabs>
+        <w:ind w:left="3600" w:hanging="360"/>
+      </w:pPr>
+      <w:rPr>
+        <w:rFonts w:hint="default" w:ascii="Wingdings" w:hAnsi="Wingdings" w:cs="Wingdings"/>
+        <w:sz w:val="20"/>
+      </w:rPr>
+    </w:lvl>
+    <w:lvl w:ilvl="5" w:tentative="0">
+      <w:start w:val="1"/>
+      <w:numFmt w:val="bullet"/>
+      <w:lvlText w:val=""/>
+      <w:lvlJc w:val="left"/>
+      <w:pPr>
+        <w:tabs>
+          <w:tab w:val="left" w:pos="4320"/>
+        </w:tabs>
+        <w:ind w:left="4320" w:hanging="360"/>
+      </w:pPr>
+      <w:rPr>
+        <w:rFonts w:hint="default" w:ascii="Wingdings" w:hAnsi="Wingdings" w:cs="Wingdings"/>
+        <w:sz w:val="20"/>
+      </w:rPr>
+    </w:lvl>
+    <w:lvl w:ilvl="6" w:tentative="0">
+      <w:start w:val="1"/>
+      <w:numFmt w:val="bullet"/>
+      <w:lvlText w:val=""/>
+      <w:lvlJc w:val="left"/>
+      <w:pPr>
+        <w:tabs>
+          <w:tab w:val="left" w:pos="5040"/>
+        </w:tabs>
+        <w:ind w:left="5040" w:hanging="360"/>
+      </w:pPr>
+      <w:rPr>
+        <w:rFonts w:hint="default" w:ascii="Wingdings" w:hAnsi="Wingdings" w:cs="Wingdings"/>
+        <w:sz w:val="20"/>
+      </w:rPr>
+    </w:lvl>
+    <w:lvl w:ilvl="7" w:tentative="0">
+      <w:start w:val="1"/>
+      <w:numFmt w:val="bullet"/>
+      <w:lvlText w:val=""/>
+      <w:lvlJc w:val="left"/>
+      <w:pPr>
+        <w:tabs>
+          <w:tab w:val="left" w:pos="5760"/>
+        </w:tabs>
+        <w:ind w:left="5760" w:hanging="360"/>
+      </w:pPr>
+      <w:rPr>
+        <w:rFonts w:hint="default" w:ascii="Wingdings" w:hAnsi="Wingdings" w:cs="Wingdings"/>
+        <w:sz w:val="20"/>
+      </w:rPr>
+    </w:lvl>
+    <w:lvl w:ilvl="8" w:tentative="0">
+      <w:start w:val="1"/>
+      <w:numFmt w:val="bullet"/>
+      <w:lvlText w:val=""/>
+      <w:lvlJc w:val="left"/>
+      <w:pPr>
+        <w:tabs>
+          <w:tab w:val="left" w:pos="6480"/>
+        </w:tabs>
+        <w:ind w:left="6480" w:hanging="360"/>
+      </w:pPr>
+      <w:rPr>
+        <w:rFonts w:hint="default" w:ascii="Wingdings" w:hAnsi="Wingdings" w:cs="Wingdings"/>
+        <w:sz w:val="20"/>
+      </w:rPr>
+    </w:lvl>
+  </w:abstractNum>
   <w:num w:numId="1">
     <w:abstractNumId w:val="0"/>
+  </w:num>
+  <w:num w:numId="2">
+    <w:abstractNumId w:val="1"/>
   </w:num>
 </w:numbering>
 </file>
@@ -3117,6 +4386,7 @@
   <w:style w:type="paragraph" w:customStyle="1" w:styleId="17">
     <w:name w:val="TieuDe1"/>
     <w:basedOn w:val="1"/>
+    <w:link w:val="24"/>
     <w:uiPriority w:val="0"/>
     <w:pPr>
       <w:spacing w:before="60" w:after="60" w:line="312" w:lineRule="auto"/>
@@ -3213,6 +4483,17 @@
       <w:rFonts w:ascii="Times New Roman" w:hAnsi="Times New Roman" w:eastAsiaTheme="minorEastAsia"/>
       <w:i/>
       <w:sz w:val="26"/>
+    </w:rPr>
+  </w:style>
+  <w:style w:type="character" w:customStyle="1" w:styleId="24">
+    <w:name w:val="TieuDe1 Char"/>
+    <w:link w:val="17"/>
+    <w:uiPriority w:val="0"/>
+    <w:rPr>
+      <w:rFonts w:ascii="Times New Roman" w:hAnsi="Times New Roman"/>
+      <w:b/>
+      <w:sz w:val="26"/>
+      <w:lang w:val="vi-VN"/>
     </w:rPr>
   </w:style>
 </w:styles>

</xml_diff>